<commit_message>
Week 2: controls library, evidence, access management, Docker deploy setup
</commit_message>
<xml_diff>
--- a/docs/SOC2-Platform-Phase1-Build-Plan-8-Weeks.docx
+++ b/docs/SOC2-Platform-Phase1-Build-Plan-8-Weeks.docx
@@ -45,15 +45,7 @@
           <w:sz w:val="30"/>
           <w:szCs w:val="30"/>
         </w:rPr>
-        <w:t xml:space="preserve">6 to </w:t>
-      </w:r>
-      <w:r>
-        <w:rPr>
-          <w:color w:val="64748B"/>
-          <w:sz w:val="30"/>
-          <w:szCs w:val="30"/>
-        </w:rPr>
-        <w:t>8-Week Delivery Schedule</w:t>
+        <w:t>6 to 8-Week Delivery Schedule</w:t>
       </w:r>
     </w:p>
     <w:p>
@@ -105,15 +97,7 @@
         </w:numPr>
       </w:pPr>
       <w:r>
-        <w:t xml:space="preserve">We fix a review day each week (for example every Friday). You review that week's increment, note any changes, and I </w:t>
-      </w:r>
-      <w:proofErr w:type="spellStart"/>
-      <w:r>
-        <w:t>fold</w:t>
-      </w:r>
-      <w:proofErr w:type="spellEnd"/>
-      <w:r>
-        <w:t xml:space="preserve"> them into the following weeks. Nothing is a black box until the end.</w:t>
+        <w:t>We fix a review day each week (for example every Friday). You review that week's increment, note any changes, and I fold them into the following weeks. Nothing is a black box until the end.</w:t>
       </w:r>
     </w:p>
     <w:p>
@@ -393,13 +377,8 @@
           </w:tcPr>
           <w:p>
             <w:r>
-              <w:t xml:space="preserve">Add or import assets with criticality; import vulnerabilities and see them </w:t>
+              <w:t>Add or import assets with criticality; import vulnerabilities and see them prioritised</w:t>
             </w:r>
-            <w:proofErr w:type="spellStart"/>
-            <w:r>
-              <w:t>prioritised</w:t>
-            </w:r>
-            <w:proofErr w:type="spellEnd"/>
           </w:p>
         </w:tc>
       </w:tr>
@@ -521,13 +500,8 @@
         </w:numPr>
       </w:pPr>
       <w:r>
-        <w:t xml:space="preserve">Multi-tenant workspaces with strict data isolation between </w:t>
-      </w:r>
-      <w:proofErr w:type="spellStart"/>
-      <w:r>
-        <w:t>organisations</w:t>
-      </w:r>
-      <w:proofErr w:type="spellEnd"/>
+        <w:t>Multi-tenant workspaces with strict data isolation between organisations</w:t>
+      </w:r>
     </w:p>
     <w:p>
       <w:pPr>
@@ -574,13 +548,8 @@
         </w:numPr>
       </w:pPr>
       <w:r>
-        <w:t xml:space="preserve">Global users: a single user (auditor, consultant, firm, or partner) can belong to more than one </w:t>
-      </w:r>
-      <w:proofErr w:type="spellStart"/>
-      <w:r>
-        <w:t>organisation</w:t>
-      </w:r>
-      <w:proofErr w:type="spellEnd"/>
+        <w:t>Global users: a single user (auditor, consultant, firm, or partner) can belong to more than one organisation</w:t>
+      </w:r>
     </w:p>
     <w:p>
       <w:pPr>
@@ -608,6 +577,8 @@
       </w:r>
     </w:p>
     <w:p>
+      <w:commentRangeStart w:id="0"/>
+      <w:commentRangeStart w:id="1"/>
       <w:r>
         <w:rPr>
           <w:b/>
@@ -629,23 +600,25 @@
     </w:p>
     <w:p>
       <w:r>
-        <w:t xml:space="preserve">Create an </w:t>
-      </w:r>
-      <w:proofErr w:type="spellStart"/>
-      <w:r>
-        <w:t>organisation</w:t>
-      </w:r>
-      <w:proofErr w:type="spellEnd"/>
-      <w:r>
-        <w:t xml:space="preserve">, self-signup, users into groups and roles, add one user across two </w:t>
-      </w:r>
-      <w:proofErr w:type="spellStart"/>
-      <w:r>
-        <w:t>organisations</w:t>
-      </w:r>
-      <w:proofErr w:type="spellEnd"/>
-      <w:r>
-        <w:t>, and view the audit log.</w:t>
+        <w:t>Create an organisation, self-signup, users into groups and roles, add one user across two organisations, and view the audit log.</w:t>
+      </w:r>
+      <w:commentRangeEnd w:id="0"/>
+      <w:r>
+        <w:rPr>
+          <w:rStyle w:val="CommentReference"/>
+          <w:sz w:val="22"/>
+          <w:szCs w:val="22"/>
+        </w:rPr>
+        <w:commentReference w:id="0"/>
+      </w:r>
+      <w:commentRangeEnd w:id="1"/>
+      <w:r>
+        <w:rPr>
+          <w:rStyle w:val="CommentReference"/>
+          <w:sz w:val="22"/>
+          <w:szCs w:val="22"/>
+        </w:rPr>
+        <w:commentReference w:id="1"/>
       </w:r>
     </w:p>
     <w:p>
@@ -946,15 +919,7 @@
     </w:p>
     <w:p>
       <w:r>
-        <w:t xml:space="preserve">The operational workflows that keep the </w:t>
-      </w:r>
-      <w:proofErr w:type="spellStart"/>
-      <w:r>
-        <w:t>programme</w:t>
-      </w:r>
-      <w:proofErr w:type="spellEnd"/>
-      <w:r>
-        <w:t xml:space="preserve"> moving.</w:t>
+        <w:t>The operational workflows that keep the programme moving.</w:t>
       </w:r>
     </w:p>
     <w:p>
@@ -1283,15 +1248,7 @@
         </w:numPr>
       </w:pPr>
       <w:r>
-        <w:t xml:space="preserve">Risk-based </w:t>
-      </w:r>
-      <w:proofErr w:type="spellStart"/>
-      <w:r>
-        <w:t>prioritisation</w:t>
-      </w:r>
-      <w:proofErr w:type="spellEnd"/>
-      <w:r>
-        <w:t xml:space="preserve"> combining severity, exploitability, and asset criticality</w:t>
+        <w:t>Risk-based prioritisation combining severity, exploitability, and asset criticality</w:t>
       </w:r>
     </w:p>
     <w:p>
@@ -1316,15 +1273,7 @@
     </w:p>
     <w:p>
       <w:r>
-        <w:t>Asset inventory and detail, vulnerability register (</w:t>
-      </w:r>
-      <w:proofErr w:type="spellStart"/>
-      <w:r>
-        <w:t>prioritised</w:t>
-      </w:r>
-      <w:proofErr w:type="spellEnd"/>
-      <w:r>
-        <w:t>) and detail.</w:t>
+        <w:t>Asset inventory and detail, vulnerability register (prioritised) and detail.</w:t>
       </w:r>
     </w:p>
     <w:p>
@@ -1349,15 +1298,7 @@
     </w:p>
     <w:p>
       <w:r>
-        <w:t xml:space="preserve">Add or import assets with criticality; import vulnerabilities, see the </w:t>
-      </w:r>
-      <w:proofErr w:type="spellStart"/>
-      <w:r>
-        <w:t>prioritised</w:t>
-      </w:r>
-      <w:proofErr w:type="spellEnd"/>
-      <w:r>
-        <w:t xml:space="preserve"> list, and set an SLA or exception.</w:t>
+        <w:t>Add or import assets with criticality; import vulnerabilities, see the prioritised list, and set an SLA or exception.</w:t>
       </w:r>
     </w:p>
     <w:p>
@@ -1425,13 +1366,8 @@
         </w:numPr>
       </w:pPr>
       <w:r>
-        <w:t xml:space="preserve">GitHub connector (test): read-only connection to a repository or </w:t>
-      </w:r>
-      <w:proofErr w:type="spellStart"/>
-      <w:r>
-        <w:t>organisation</w:t>
-      </w:r>
-      <w:proofErr w:type="spellEnd"/>
+        <w:t>GitHub connector (test): read-only connection to a repository or organisation</w:t>
+      </w:r>
     </w:p>
     <w:p>
       <w:pPr>
@@ -1804,15 +1740,7 @@
         </w:numPr>
       </w:pPr>
       <w:r>
-        <w:t xml:space="preserve">For the GitHub connector test, read-only access to a repository or </w:t>
-      </w:r>
-      <w:proofErr w:type="spellStart"/>
-      <w:r>
-        <w:t>organisation</w:t>
-      </w:r>
-      <w:proofErr w:type="spellEnd"/>
-      <w:r>
-        <w:t xml:space="preserve"> is provided.</w:t>
+        <w:t>For the GitHub connector test, read-only access to a repository or organisation is provided.</w:t>
       </w:r>
     </w:p>
     <w:p>
@@ -1836,20 +1764,12 @@
         </w:numPr>
       </w:pPr>
       <w:r>
-        <w:t xml:space="preserve">Branding and design: the </w:t>
-      </w:r>
-      <w:proofErr w:type="spellStart"/>
-      <w:r>
-        <w:t>colour</w:t>
-      </w:r>
-      <w:proofErr w:type="spellEnd"/>
-      <w:r>
-        <w:t xml:space="preserve"> palette and design recommendations for the platform's branding will be shared from your side, as Sir Faheem mentioned.</w:t>
+        <w:t>Branding and design: the colour palette and design recommendations for the platform's branding will be shared from your side, as Sir Faheem mentioned.</w:t>
       </w:r>
     </w:p>
     <w:sectPr>
-      <w:headerReference w:type="default" r:id="rId7"/>
-      <w:footerReference w:type="default" r:id="rId8"/>
+      <w:headerReference w:type="default" r:id="rId11"/>
+      <w:footerReference w:type="default" r:id="rId12"/>
       <w:pgSz w:w="12240" w:h="15840"/>
       <w:pgMar w:top="1440" w:right="1440" w:bottom="1440" w:left="1440" w:header="708" w:footer="708" w:gutter="0"/>
       <w:cols w:space="720"/>
@@ -1857,6 +1777,61 @@
     </w:sectPr>
   </w:body>
 </w:document>
+</file>
+
+<file path=word/comments.xml><?xml version="1.0" encoding="utf-8"?>
+<w:comments xmlns:wpc="http://schemas.microsoft.com/office/word/2010/wordprocessingCanvas" xmlns:cx="http://schemas.microsoft.com/office/drawing/2014/chartex" xmlns:cx1="http://schemas.microsoft.com/office/drawing/2015/9/8/chartex" xmlns:cx2="http://schemas.microsoft.com/office/drawing/2015/10/21/chartex" xmlns:cx3="http://schemas.microsoft.com/office/drawing/2016/5/9/chartex" xmlns:cx4="http://schemas.microsoft.com/office/drawing/2016/5/10/chartex" xmlns:cx5="http://schemas.microsoft.com/office/drawing/2016/5/11/chartex" xmlns:cx6="http://schemas.microsoft.com/office/drawing/2016/5/12/chartex" xmlns:cx7="http://schemas.microsoft.com/office/drawing/2016/5/13/chartex" xmlns:cx8="http://schemas.microsoft.com/office/drawing/2016/5/14/chartex" xmlns:mc="http://schemas.openxmlformats.org/markup-compatibility/2006" xmlns:aink="http://schemas.microsoft.com/office/drawing/2016/ink" xmlns:am3d="http://schemas.microsoft.com/office/drawing/2017/model3d" xmlns:o="urn:schemas-microsoft-com:office:office" xmlns:oel="http://schemas.microsoft.com/office/2019/extlst" xmlns:r="http://schemas.openxmlformats.org/officeDocument/2006/relationships" xmlns:m="http://schemas.openxmlformats.org/officeDocument/2006/math" xmlns:v="urn:schemas-microsoft-com:vml" xmlns:wp14="http://schemas.microsoft.com/office/word/2010/wordprocessingDrawing" xmlns:wp="http://schemas.openxmlformats.org/drawingml/2006/wordprocessingDrawing" xmlns:w10="urn:schemas-microsoft-com:office:word" xmlns:w="http://schemas.openxmlformats.org/wordprocessingml/2006/main" xmlns:w14="http://schemas.microsoft.com/office/word/2010/wordml" xmlns:w15="http://schemas.microsoft.com/office/word/2012/wordml" xmlns:w16cei="http://schemas.microsoft.com/office/word/2026/wordml/cei" xmlns:w16cex="http://schemas.microsoft.com/office/word/2018/wordml/cex" xmlns:w16cid="http://schemas.microsoft.com/office/word/2016/wordml/cid" xmlns:w16="http://schemas.microsoft.com/office/word/2018/wordml" xmlns:w16du="http://schemas.microsoft.com/office/word/2023/wordml/word16du" xmlns:w16sdtdh="http://schemas.microsoft.com/office/word/2020/wordml/sdtdatahash" xmlns:w16sdtfl="http://schemas.microsoft.com/office/word/2024/wordml/sdtformatlock" xmlns:w16se="http://schemas.microsoft.com/office/word/2015/wordml/symex" xmlns:wpg="http://schemas.microsoft.com/office/word/2010/wordprocessingGroup" xmlns:wpi="http://schemas.microsoft.com/office/word/2010/wordprocessingInk" xmlns:wne="http://schemas.microsoft.com/office/word/2006/wordml" xmlns:wps="http://schemas.microsoft.com/office/word/2010/wordprocessingShape" mc:Ignorable="w14 w15 w16se w16cid w16 w16cex w16sdtdh w16sdtfl w16du wp14">
+  <w:comment w:id="0" w:author="Mehboob A" w:date="2026-08-14T19:17:00Z" w:initials="MA">
+    <w:p>
+      <w:pPr>
+        <w:pStyle w:val="CommentText"/>
+      </w:pPr>
+      <w:r>
+        <w:rPr>
+          <w:rStyle w:val="CommentReference"/>
+        </w:rPr>
+        <w:annotationRef/>
+      </w:r>
+      <w:r>
+        <w:t>no provisioning-status view in the UI; no self-service password reset (support-only — not in the Week-1 spec, just noting).</w:t>
+      </w:r>
+    </w:p>
+  </w:comment>
+  <w:comment w:id="1" w:author="Mehboob A" w:date="2026-08-14T19:18:00Z" w:initials="MA">
+    <w:p>
+      <w:pPr>
+        <w:pStyle w:val="CommentText"/>
+      </w:pPr>
+      <w:r>
+        <w:rPr>
+          <w:rStyle w:val="CommentReference"/>
+        </w:rPr>
+        <w:annotationRef/>
+      </w:r>
+    </w:p>
+  </w:comment>
+</w:comments>
+</file>
+
+<file path=word/commentsExtended.xml><?xml version="1.0" encoding="utf-8"?>
+<w15:commentsEx xmlns:wpc="http://schemas.microsoft.com/office/word/2010/wordprocessingCanvas" xmlns:cx="http://schemas.microsoft.com/office/drawing/2014/chartex" xmlns:cx1="http://schemas.microsoft.com/office/drawing/2015/9/8/chartex" xmlns:cx2="http://schemas.microsoft.com/office/drawing/2015/10/21/chartex" xmlns:cx3="http://schemas.microsoft.com/office/drawing/2016/5/9/chartex" xmlns:cx4="http://schemas.microsoft.com/office/drawing/2016/5/10/chartex" xmlns:cx5="http://schemas.microsoft.com/office/drawing/2016/5/11/chartex" xmlns:cx6="http://schemas.microsoft.com/office/drawing/2016/5/12/chartex" xmlns:cx7="http://schemas.microsoft.com/office/drawing/2016/5/13/chartex" xmlns:cx8="http://schemas.microsoft.com/office/drawing/2016/5/14/chartex" xmlns:mc="http://schemas.openxmlformats.org/markup-compatibility/2006" xmlns:aink="http://schemas.microsoft.com/office/drawing/2016/ink" xmlns:am3d="http://schemas.microsoft.com/office/drawing/2017/model3d" xmlns:o="urn:schemas-microsoft-com:office:office" xmlns:oel="http://schemas.microsoft.com/office/2019/extlst" xmlns:r="http://schemas.openxmlformats.org/officeDocument/2006/relationships" xmlns:m="http://schemas.openxmlformats.org/officeDocument/2006/math" xmlns:v="urn:schemas-microsoft-com:vml" xmlns:wp14="http://schemas.microsoft.com/office/word/2010/wordprocessingDrawing" xmlns:wp="http://schemas.openxmlformats.org/drawingml/2006/wordprocessingDrawing" xmlns:w10="urn:schemas-microsoft-com:office:word" xmlns:w="http://schemas.openxmlformats.org/wordprocessingml/2006/main" xmlns:w14="http://schemas.microsoft.com/office/word/2010/wordml" xmlns:w15="http://schemas.microsoft.com/office/word/2012/wordml" xmlns:w16cei="http://schemas.microsoft.com/office/word/2026/wordml/cei" xmlns:w16cex="http://schemas.microsoft.com/office/word/2018/wordml/cex" xmlns:w16cid="http://schemas.microsoft.com/office/word/2016/wordml/cid" xmlns:w16="http://schemas.microsoft.com/office/word/2018/wordml" xmlns:w16du="http://schemas.microsoft.com/office/word/2023/wordml/word16du" xmlns:w16sdtdh="http://schemas.microsoft.com/office/word/2020/wordml/sdtdatahash" xmlns:w16sdtfl="http://schemas.microsoft.com/office/word/2024/wordml/sdtformatlock" xmlns:w16se="http://schemas.microsoft.com/office/word/2015/wordml/symex" xmlns:wpg="http://schemas.microsoft.com/office/word/2010/wordprocessingGroup" xmlns:wpi="http://schemas.microsoft.com/office/word/2010/wordprocessingInk" xmlns:wne="http://schemas.microsoft.com/office/word/2006/wordml" xmlns:wps="http://schemas.microsoft.com/office/word/2010/wordprocessingShape" mc:Ignorable="w14 w15 w16se w16cid w16 w16cex w16sdtdh w16sdtfl w16du wp14">
+  <w15:commentEx w15:paraId="3E4D7A9A" w15:done="0"/>
+  <w15:commentEx w15:paraId="1F44EBEF" w15:paraIdParent="3E4D7A9A" w15:done="0"/>
+</w15:commentsEx>
+</file>
+
+<file path=word/commentsExtensible.xml><?xml version="1.0" encoding="utf-8"?>
+<w16cex:commentsExtensible xmlns:wpc="http://schemas.microsoft.com/office/word/2010/wordprocessingCanvas" xmlns:cx="http://schemas.microsoft.com/office/drawing/2014/chartex" xmlns:cx1="http://schemas.microsoft.com/office/drawing/2015/9/8/chartex" xmlns:cx2="http://schemas.microsoft.com/office/drawing/2015/10/21/chartex" xmlns:cx3="http://schemas.microsoft.com/office/drawing/2016/5/9/chartex" xmlns:cx4="http://schemas.microsoft.com/office/drawing/2016/5/10/chartex" xmlns:cx5="http://schemas.microsoft.com/office/drawing/2016/5/11/chartex" xmlns:cx6="http://schemas.microsoft.com/office/drawing/2016/5/12/chartex" xmlns:cx7="http://schemas.microsoft.com/office/drawing/2016/5/13/chartex" xmlns:cx8="http://schemas.microsoft.com/office/drawing/2016/5/14/chartex" xmlns:cr="http://schemas.microsoft.com/office/comments/2020/reactions" xmlns:mc="http://schemas.openxmlformats.org/markup-compatibility/2006" xmlns:aink="http://schemas.microsoft.com/office/drawing/2016/ink" xmlns:am3d="http://schemas.microsoft.com/office/drawing/2017/model3d" xmlns:o="urn:schemas-microsoft-com:office:office" xmlns:oel="http://schemas.microsoft.com/office/2019/extlst" xmlns:r="http://schemas.openxmlformats.org/officeDocument/2006/relationships" xmlns:m="http://schemas.openxmlformats.org/officeDocument/2006/math" xmlns:v="urn:schemas-microsoft-com:vml" xmlns:wp14="http://schemas.microsoft.com/office/word/2010/wordprocessingDrawing" xmlns:wp="http://schemas.openxmlformats.org/drawingml/2006/wordprocessingDrawing" xmlns:w10="urn:schemas-microsoft-com:office:word" xmlns:w="http://schemas.openxmlformats.org/wordprocessingml/2006/main" xmlns:w14="http://schemas.microsoft.com/office/word/2010/wordml" xmlns:w15="http://schemas.microsoft.com/office/word/2012/wordml" xmlns:w16cei="http://schemas.microsoft.com/office/word/2026/wordml/cei" xmlns:w16cex="http://schemas.microsoft.com/office/word/2018/wordml/cex" xmlns:w16cid="http://schemas.microsoft.com/office/word/2016/wordml/cid" xmlns:w16="http://schemas.microsoft.com/office/word/2018/wordml" xmlns:w16du="http://schemas.microsoft.com/office/word/2023/wordml/word16du" xmlns:w16sdtdh="http://schemas.microsoft.com/office/word/2020/wordml/sdtdatahash" xmlns:w16sdtfl="http://schemas.microsoft.com/office/word/2024/wordml/sdtformatlock" xmlns:w16se="http://schemas.microsoft.com/office/word/2015/wordml/symex" xmlns:wpg="http://schemas.microsoft.com/office/word/2010/wordprocessingGroup" xmlns:wpi="http://schemas.microsoft.com/office/word/2010/wordprocessingInk" xmlns:wne="http://schemas.microsoft.com/office/word/2006/wordml" xmlns:wps="http://schemas.microsoft.com/office/word/2010/wordprocessingShape" mc:Ignorable="w14 w15 w16se w16cid w16 w16cex w16sdtdh w16sdtfl cr w16du wp14">
+  <w16cex:commentExtensible w16cex:durableId="48F0AE39" w16cex:dateUtc="2026-08-14T14:17:00Z"/>
+  <w16cex:commentExtensible w16cex:durableId="2B7A22AD" w16cex:dateUtc="2026-08-14T14:18:00Z"/>
+</w16cex:commentsExtensible>
+</file>
+
+<file path=word/commentsIds.xml><?xml version="1.0" encoding="utf-8"?>
+<w16cid:commentsIds xmlns:wpc="http://schemas.microsoft.com/office/word/2010/wordprocessingCanvas" xmlns:cx="http://schemas.microsoft.com/office/drawing/2014/chartex" xmlns:cx1="http://schemas.microsoft.com/office/drawing/2015/9/8/chartex" xmlns:cx2="http://schemas.microsoft.com/office/drawing/2015/10/21/chartex" xmlns:cx3="http://schemas.microsoft.com/office/drawing/2016/5/9/chartex" xmlns:cx4="http://schemas.microsoft.com/office/drawing/2016/5/10/chartex" xmlns:cx5="http://schemas.microsoft.com/office/drawing/2016/5/11/chartex" xmlns:cx6="http://schemas.microsoft.com/office/drawing/2016/5/12/chartex" xmlns:cx7="http://schemas.microsoft.com/office/drawing/2016/5/13/chartex" xmlns:cx8="http://schemas.microsoft.com/office/drawing/2016/5/14/chartex" xmlns:mc="http://schemas.openxmlformats.org/markup-compatibility/2006" xmlns:aink="http://schemas.microsoft.com/office/drawing/2016/ink" xmlns:am3d="http://schemas.microsoft.com/office/drawing/2017/model3d" xmlns:o="urn:schemas-microsoft-com:office:office" xmlns:oel="http://schemas.microsoft.com/office/2019/extlst" xmlns:r="http://schemas.openxmlformats.org/officeDocument/2006/relationships" xmlns:m="http://schemas.openxmlformats.org/officeDocument/2006/math" xmlns:v="urn:schemas-microsoft-com:vml" xmlns:wp14="http://schemas.microsoft.com/office/word/2010/wordprocessingDrawing" xmlns:wp="http://schemas.openxmlformats.org/drawingml/2006/wordprocessingDrawing" xmlns:w10="urn:schemas-microsoft-com:office:word" xmlns:w="http://schemas.openxmlformats.org/wordprocessingml/2006/main" xmlns:w14="http://schemas.microsoft.com/office/word/2010/wordml" xmlns:w15="http://schemas.microsoft.com/office/word/2012/wordml" xmlns:w16cei="http://schemas.microsoft.com/office/word/2026/wordml/cei" xmlns:w16cex="http://schemas.microsoft.com/office/word/2018/wordml/cex" xmlns:w16cid="http://schemas.microsoft.com/office/word/2016/wordml/cid" xmlns:w16="http://schemas.microsoft.com/office/word/2018/wordml" xmlns:w16du="http://schemas.microsoft.com/office/word/2023/wordml/word16du" xmlns:w16sdtdh="http://schemas.microsoft.com/office/word/2020/wordml/sdtdatahash" xmlns:w16sdtfl="http://schemas.microsoft.com/office/word/2024/wordml/sdtformatlock" xmlns:w16se="http://schemas.microsoft.com/office/word/2015/wordml/symex" xmlns:wpg="http://schemas.microsoft.com/office/word/2010/wordprocessingGroup" xmlns:wpi="http://schemas.microsoft.com/office/word/2010/wordprocessingInk" xmlns:wne="http://schemas.microsoft.com/office/word/2006/wordml" xmlns:wps="http://schemas.microsoft.com/office/word/2010/wordprocessingShape" mc:Ignorable="w14 w15 w16se w16cid w16 w16cex w16sdtdh w16sdtfl w16du wp14">
+  <w16cid:commentId w16cid:paraId="3E4D7A9A" w16cid:durableId="48F0AE39"/>
+  <w16cid:commentId w16cid:paraId="1F44EBEF" w16cid:durableId="2B7A22AD"/>
+</w16cid:commentsIds>
 </file>
 
 <file path=word/endnotes.xml><?xml version="1.0" encoding="utf-8"?>
@@ -2065,6 +2040,14 @@
     </w:lvlOverride>
   </w:num>
 </w:numbering>
+</file>
+
+<file path=word/people.xml><?xml version="1.0" encoding="utf-8"?>
+<w15:people xmlns:wpc="http://schemas.microsoft.com/office/word/2010/wordprocessingCanvas" xmlns:cx="http://schemas.microsoft.com/office/drawing/2014/chartex" xmlns:cx1="http://schemas.microsoft.com/office/drawing/2015/9/8/chartex" xmlns:cx2="http://schemas.microsoft.com/office/drawing/2015/10/21/chartex" xmlns:cx3="http://schemas.microsoft.com/office/drawing/2016/5/9/chartex" xmlns:cx4="http://schemas.microsoft.com/office/drawing/2016/5/10/chartex" xmlns:cx5="http://schemas.microsoft.com/office/drawing/2016/5/11/chartex" xmlns:cx6="http://schemas.microsoft.com/office/drawing/2016/5/12/chartex" xmlns:cx7="http://schemas.microsoft.com/office/drawing/2016/5/13/chartex" xmlns:cx8="http://schemas.microsoft.com/office/drawing/2016/5/14/chartex" xmlns:mc="http://schemas.openxmlformats.org/markup-compatibility/2006" xmlns:aink="http://schemas.microsoft.com/office/drawing/2016/ink" xmlns:am3d="http://schemas.microsoft.com/office/drawing/2017/model3d" xmlns:o="urn:schemas-microsoft-com:office:office" xmlns:oel="http://schemas.microsoft.com/office/2019/extlst" xmlns:r="http://schemas.openxmlformats.org/officeDocument/2006/relationships" xmlns:m="http://schemas.openxmlformats.org/officeDocument/2006/math" xmlns:v="urn:schemas-microsoft-com:vml" xmlns:wp14="http://schemas.microsoft.com/office/word/2010/wordprocessingDrawing" xmlns:wp="http://schemas.openxmlformats.org/drawingml/2006/wordprocessingDrawing" xmlns:w10="urn:schemas-microsoft-com:office:word" xmlns:w="http://schemas.openxmlformats.org/wordprocessingml/2006/main" xmlns:w14="http://schemas.microsoft.com/office/word/2010/wordml" xmlns:w15="http://schemas.microsoft.com/office/word/2012/wordml" xmlns:w16cei="http://schemas.microsoft.com/office/word/2026/wordml/cei" xmlns:w16cex="http://schemas.microsoft.com/office/word/2018/wordml/cex" xmlns:w16cid="http://schemas.microsoft.com/office/word/2016/wordml/cid" xmlns:w16="http://schemas.microsoft.com/office/word/2018/wordml" xmlns:w16du="http://schemas.microsoft.com/office/word/2023/wordml/word16du" xmlns:w16sdtdh="http://schemas.microsoft.com/office/word/2020/wordml/sdtdatahash" xmlns:w16sdtfl="http://schemas.microsoft.com/office/word/2024/wordml/sdtformatlock" xmlns:w16se="http://schemas.microsoft.com/office/word/2015/wordml/symex" xmlns:wpg="http://schemas.microsoft.com/office/word/2010/wordprocessingGroup" xmlns:wpi="http://schemas.microsoft.com/office/word/2010/wordprocessingInk" xmlns:wne="http://schemas.microsoft.com/office/word/2006/wordml" xmlns:wps="http://schemas.microsoft.com/office/word/2010/wordprocessingShape" mc:Ignorable="w14 w15 w16se w16cid w16 w16cex w16sdtdh w16sdtfl w16du wp14">
+  <w15:person w15:author="Mehboob A">
+    <w15:presenceInfo w15:providerId="Windows Live" w15:userId="20010421cd9850a7"/>
+  </w15:person>
+</w15:people>
 </file>
 
 <file path=word/styles.xml><?xml version="1.0" encoding="utf-8"?>
@@ -2472,7 +2455,6 @@
   <w:style w:type="character" w:default="1" w:styleId="DefaultParagraphFont">
     <w:name w:val="Default Paragraph Font"/>
     <w:uiPriority w:val="1"/>
-    <w:semiHidden/>
     <w:unhideWhenUsed/>
   </w:style>
   <w:style w:type="table" w:default="1" w:styleId="TableNormal">
@@ -2588,6 +2570,56 @@
     <w:rPr>
       <w:sz w:val="20"/>
       <w:szCs w:val="20"/>
+    </w:rPr>
+  </w:style>
+  <w:style w:type="character" w:styleId="CommentReference">
+    <w:name w:val="annotation reference"/>
+    <w:basedOn w:val="DefaultParagraphFont"/>
+    <w:rsid w:val="008E2707"/>
+    <w:rPr>
+      <w:sz w:val="16"/>
+      <w:szCs w:val="16"/>
+    </w:rPr>
+  </w:style>
+  <w:style w:type="paragraph" w:styleId="CommentText">
+    <w:name w:val="annotation text"/>
+    <w:basedOn w:val="Normal"/>
+    <w:link w:val="CommentTextChar"/>
+    <w:rsid w:val="008E2707"/>
+    <w:rPr>
+      <w:sz w:val="20"/>
+      <w:szCs w:val="20"/>
+    </w:rPr>
+  </w:style>
+  <w:style w:type="character" w:customStyle="1" w:styleId="CommentTextChar">
+    <w:name w:val="Comment Text Char"/>
+    <w:basedOn w:val="DefaultParagraphFont"/>
+    <w:link w:val="CommentText"/>
+    <w:rsid w:val="008E2707"/>
+    <w:rPr>
+      <w:color w:val="1E293B"/>
+    </w:rPr>
+  </w:style>
+  <w:style w:type="paragraph" w:styleId="CommentSubject">
+    <w:name w:val="annotation subject"/>
+    <w:basedOn w:val="CommentText"/>
+    <w:next w:val="CommentText"/>
+    <w:link w:val="CommentSubjectChar"/>
+    <w:rsid w:val="008E2707"/>
+    <w:rPr>
+      <w:b/>
+      <w:bCs/>
+    </w:rPr>
+  </w:style>
+  <w:style w:type="character" w:customStyle="1" w:styleId="CommentSubjectChar">
+    <w:name w:val="Comment Subject Char"/>
+    <w:basedOn w:val="CommentTextChar"/>
+    <w:link w:val="CommentSubject"/>
+    <w:rsid w:val="008E2707"/>
+    <w:rPr>
+      <w:b/>
+      <w:bCs/>
+      <w:color w:val="1E293B"/>
     </w:rPr>
   </w:style>
 </w:styles>

</xml_diff>